<commit_message>
added information to "Part 1 Improvemnts.docx"
</commit_message>
<xml_diff>
--- a/Documents/Part 1 Improvements.docx
+++ b/Documents/Part 1 Improvements.docx
@@ -1,8 +1,592 @@
 
 <file path=word/document.xml><?xml version="1.0" encoding="utf-8"?>
-<w:document xmlns:wpc="http://schemas.microsoft.com/office/word/2010/wordprocessingCanvas" xmlns:cx="http://schemas.microsoft.com/office/drawing/2014/chartex" xmlns:cx1="http://schemas.microsoft.com/office/drawing/2015/9/8/chartex" xmlns:cx2="http://schemas.microsoft.com/office/drawing/2015/10/21/chartex" xmlns:cx3="http://schemas.microsoft.com/office/drawing/2016/5/9/chartex" xmlns:cx4="http://schemas.microsoft.com/office/drawing/2016/5/10/chartex" xmlns:cx5="http://schemas.microsoft.com/office/drawing/2016/5/11/chartex" xmlns:cx6="http://schemas.microsoft.com/office/drawing/2016/5/12/chartex" xmlns:cx7="http://schemas.microsoft.com/office/drawing/2016/5/13/chartex" xmlns:cx8="http://schemas.microsoft.com/office/drawing/2016/5/14/chartex" xmlns:mc="http://schemas.openxmlformats.org/markup-compatibility/2006" xmlns:aink="http://schemas.microsoft.com/office/drawing/2016/ink" xmlns:am3d="http://schemas.microsoft.com/office/drawing/2017/model3d" xmlns:o="urn:schemas-microsoft-com:office:office" xmlns:oel="http://schemas.microsoft.com/office/2019/extlst" xmlns:r="http://schemas.openxmlformats.org/officeDocument/2006/relationships" xmlns:m="http://schemas.openxmlformats.org/officeDocument/2006/math" xmlns:v="urn:schemas-microsoft-com:vml" xmlns:wp14="http://schemas.microsoft.com/office/word/2010/wordprocessingDrawing" xmlns:wp="http://schemas.openxmlformats.org/drawingml/2006/wordprocessingDrawing" xmlns:w10="urn:schemas-microsoft-com:office:word" xmlns:w="http://schemas.openxmlformats.org/wordprocessingml/2006/main" xmlns:w14="http://schemas.microsoft.com/office/word/2010/wordml" xmlns:w15="http://schemas.microsoft.com/office/word/2012/wordml" xmlns:w16cei="http://schemas.microsoft.com/office/word/2026/wordml/cei" xmlns:w16cex="http://schemas.microsoft.com/office/word/2018/wordml/cex" xmlns:w16cid="http://schemas.microsoft.com/office/word/2016/wordml/cid" xmlns:w16="http://schemas.microsoft.com/office/word/2018/wordml" xmlns:w16du="http://schemas.microsoft.com/office/word/2023/wordml/word16du" xmlns:w16sdtdh="http://schemas.microsoft.com/office/word/2020/wordml/sdtdatahash" xmlns:w16sdtfl="http://schemas.microsoft.com/office/word/2024/wordml/sdtformatlock" xmlns:w16se="http://schemas.microsoft.com/office/word/2015/wordml/symex" xmlns:wpg="http://schemas.microsoft.com/office/word/2010/wordprocessingGroup" xmlns:wpi="http://schemas.microsoft.com/office/word/2010/wordprocessingInk" xmlns:wne="http://schemas.microsoft.com/office/word/2006/wordml" xmlns:wps="http://schemas.microsoft.com/office/word/2010/wordprocessingShape" mc:Ignorable="w14 w15 w16se w16cid w16 w16cex w16sdtdh w16sdtfl w16du wp14">
+<w:document xmlns:wpc="http://schemas.microsoft.com/office/word/2010/wordprocessingCanvas" xmlns:cx="http://schemas.microsoft.com/office/drawing/2014/chartex" xmlns:cx1="http://schemas.microsoft.com/office/drawing/2015/9/8/chartex" xmlns:cx2="http://schemas.microsoft.com/office/drawing/2015/10/21/chartex" xmlns:cx3="http://schemas.microsoft.com/office/drawing/2016/5/9/chartex" xmlns:cx4="http://schemas.microsoft.com/office/drawing/2016/5/10/chartex" xmlns:cx5="http://schemas.microsoft.com/office/drawing/2016/5/11/chartex" xmlns:cx6="http://schemas.microsoft.com/office/drawing/2016/5/12/chartex" xmlns:cx7="http://schemas.microsoft.com/office/drawing/2016/5/13/chartex" xmlns:cx8="http://schemas.microsoft.com/office/drawing/2016/5/14/chartex" xmlns:mc="http://schemas.openxmlformats.org/markup-compatibility/2006" xmlns:aink="http://schemas.microsoft.com/office/drawing/2016/ink" xmlns:am3d="http://schemas.microsoft.com/office/drawing/2017/model3d" xmlns:o="urn:schemas-microsoft-com:office:office" xmlns:oel="http://schemas.microsoft.com/office/2019/extlst" xmlns:r="http://schemas.openxmlformats.org/officeDocument/2006/relationships" xmlns:m="http://schemas.openxmlformats.org/officeDocument/2006/math" xmlns:v="urn:schemas-microsoft-com:vml" xmlns:wp14="http://schemas.microsoft.com/office/word/2010/wordprocessingDrawing" xmlns:wp="http://schemas.openxmlformats.org/drawingml/2006/wordprocessingDrawing" xmlns:w10="urn:schemas-microsoft-com:office:word" xmlns:w="http://schemas.openxmlformats.org/wordprocessingml/2006/main" xmlns:w14="http://schemas.microsoft.com/office/word/2010/wordml" xmlns:w15="http://schemas.microsoft.com/office/word/2012/wordml" xmlns:w16cex="http://schemas.microsoft.com/office/word/2018/wordml/cex" xmlns:w16cid="http://schemas.microsoft.com/office/word/2016/wordml/cid" xmlns:w16="http://schemas.microsoft.com/office/word/2018/wordml" xmlns:w16du="http://schemas.microsoft.com/office/word/2023/wordml/word16du" xmlns:w16sdtdh="http://schemas.microsoft.com/office/word/2020/wordml/sdtdatahash" xmlns:w16sdtfl="http://schemas.microsoft.com/office/word/2024/wordml/sdtformatlock" xmlns:w16se="http://schemas.microsoft.com/office/word/2015/wordml/symex" xmlns:wpg="http://schemas.microsoft.com/office/word/2010/wordprocessingGroup" xmlns:wpi="http://schemas.microsoft.com/office/word/2010/wordprocessingInk" xmlns:wne="http://schemas.microsoft.com/office/word/2006/wordml" xmlns:wps="http://schemas.microsoft.com/office/word/2010/wordprocessingShape" mc:Ignorable="w14 w15 w16se w16cid w16 w16cex w16sdtdh w16sdtfl w16du wp14">
   <w:body>
+    <w:p>
+      <w:r>
+        <w:t>Name: Frank TAGUEMKAM-TOKAM</w:t>
+      </w:r>
+    </w:p>
+    <w:p>
+      <w:r>
+        <w:t>Student Number: ST10534336</w:t>
+      </w:r>
+    </w:p>
     <w:p/>
+    <w:p/>
+    <w:p>
+      <w:pPr>
+        <w:pStyle w:val="Heading2"/>
+      </w:pPr>
+      <w:r>
+        <w:t>General Improvements</w:t>
+      </w:r>
+    </w:p>
+    <w:p>
+      <w:pPr>
+        <w:pStyle w:val="ListParagraph"/>
+        <w:numPr>
+          <w:ilvl w:val="0"/>
+          <w:numId w:val="6"/>
+        </w:numPr>
+      </w:pPr>
+      <w:r>
+        <w:t xml:space="preserve">Added padding to every section </w:t>
+      </w:r>
+      <w:r>
+        <w:t>of</w:t>
+      </w:r>
+      <w:r>
+        <w:t xml:space="preserve"> the website</w:t>
+      </w:r>
+    </w:p>
+    <w:p>
+      <w:pPr>
+        <w:pStyle w:val="ListParagraph"/>
+        <w:numPr>
+          <w:ilvl w:val="0"/>
+          <w:numId w:val="6"/>
+        </w:numPr>
+      </w:pPr>
+      <w:r>
+        <w:t>All text is either white, maroon, dark-maroon, light-maroon,</w:t>
+      </w:r>
+      <w:r>
+        <w:t xml:space="preserve"> red and black</w:t>
+      </w:r>
+      <w:r>
+        <w:t>.</w:t>
+      </w:r>
+    </w:p>
+    <w:p>
+      <w:pPr>
+        <w:pStyle w:val="ListParagraph"/>
+        <w:numPr>
+          <w:ilvl w:val="0"/>
+          <w:numId w:val="6"/>
+        </w:numPr>
+      </w:pPr>
+      <w:r>
+        <w:t xml:space="preserve">Every page has a hero-section that takes up about </w:t>
+      </w:r>
+      <w:r>
+        <w:t>calc(100vh-navbarHeight</w:t>
+      </w:r>
+      <w:r>
+        <w:t>)</w:t>
+      </w:r>
+    </w:p>
+    <w:p/>
+    <w:p>
+      <w:pPr>
+        <w:pStyle w:val="Heading2"/>
+      </w:pPr>
+      <w:r>
+        <w:t>Home-Page</w:t>
+      </w:r>
+    </w:p>
+    <w:p>
+      <w:pPr>
+        <w:pStyle w:val="ListParagraph"/>
+        <w:numPr>
+          <w:ilvl w:val="0"/>
+          <w:numId w:val="1"/>
+        </w:numPr>
+      </w:pPr>
+      <w:r>
+        <w:t xml:space="preserve">Made </w:t>
+      </w:r>
+      <w:r>
+        <w:t xml:space="preserve">the navigation bar more aesthetically pleasing by </w:t>
+      </w:r>
+      <w:r>
+        <w:t>adding a background-</w:t>
+      </w:r>
+      <w:r>
+        <w:t>colour</w:t>
+      </w:r>
+    </w:p>
+    <w:p>
+      <w:pPr>
+        <w:pStyle w:val="ListParagraph"/>
+        <w:numPr>
+          <w:ilvl w:val="0"/>
+          <w:numId w:val="1"/>
+        </w:numPr>
+      </w:pPr>
+      <w:r>
+        <w:t xml:space="preserve">Gave the hyperlinks on the navigation bar </w:t>
+      </w:r>
+      <w:r>
+        <w:t>a border and also created a class to give a red background on the navbar link of the website you are currently on.</w:t>
+      </w:r>
+    </w:p>
+    <w:p>
+      <w:pPr>
+        <w:pStyle w:val="ListParagraph"/>
+        <w:numPr>
+          <w:ilvl w:val="0"/>
+          <w:numId w:val="1"/>
+        </w:numPr>
+      </w:pPr>
+      <w:r>
+        <w:t xml:space="preserve">Made it so that the border </w:t>
+      </w:r>
+      <w:r>
+        <w:t>colour</w:t>
+      </w:r>
+      <w:r>
+        <w:t xml:space="preserve"> of the navbar link </w:t>
+      </w:r>
+      <w:r>
+        <w:t>changes to a slightly light red when hovered on</w:t>
+      </w:r>
+      <w:r>
+        <w:t>.</w:t>
+      </w:r>
+    </w:p>
+    <w:p>
+      <w:pPr>
+        <w:pStyle w:val="ListParagraph"/>
+        <w:numPr>
+          <w:ilvl w:val="0"/>
+          <w:numId w:val="1"/>
+        </w:numPr>
+      </w:pPr>
+      <w:r>
+        <w:t>Added a background video that uses the company logo as a mask to create a “cool” look</w:t>
+      </w:r>
+      <w:r>
+        <w:t>, it is located on the home page’s hero-section</w:t>
+      </w:r>
+    </w:p>
+    <w:p>
+      <w:pPr>
+        <w:pStyle w:val="ListParagraph"/>
+        <w:numPr>
+          <w:ilvl w:val="0"/>
+          <w:numId w:val="1"/>
+        </w:numPr>
+      </w:pPr>
+      <w:r>
+        <w:t xml:space="preserve">Added a </w:t>
+      </w:r>
+      <w:r>
+        <w:t>call-to-action</w:t>
+      </w:r>
+      <w:r>
+        <w:t xml:space="preserve"> section that links to the “about” page where you can learn more about the company</w:t>
+      </w:r>
+      <w:r>
+        <w:t>.</w:t>
+      </w:r>
+    </w:p>
+    <w:p>
+      <w:pPr>
+        <w:pStyle w:val="ListParagraph"/>
+        <w:numPr>
+          <w:ilvl w:val="0"/>
+          <w:numId w:val="1"/>
+        </w:numPr>
+      </w:pPr>
+      <w:r>
+        <w:t>Improved the look of the cards that highlight the companies’ strengths and customer appeal.</w:t>
+      </w:r>
+      <w:r>
+        <w:t xml:space="preserve"> The cards enlarge when hovered on and the other cards get blurred</w:t>
+      </w:r>
+    </w:p>
+    <w:p>
+      <w:pPr>
+        <w:pStyle w:val="ListParagraph"/>
+        <w:numPr>
+          <w:ilvl w:val="0"/>
+          <w:numId w:val="1"/>
+        </w:numPr>
+      </w:pPr>
+      <w:r>
+        <w:t xml:space="preserve">Added a </w:t>
+      </w:r>
+      <w:r>
+        <w:t>call-to-action</w:t>
+      </w:r>
+      <w:r>
+        <w:t xml:space="preserve"> </w:t>
+      </w:r>
+      <w:r>
+        <w:t>section that links to the services page. It highlights some of the services offered by Pristine Renovations</w:t>
+      </w:r>
+      <w:r>
+        <w:t xml:space="preserve"> and then has a call-to-action button that takes you to the services page for more information.</w:t>
+      </w:r>
+    </w:p>
+    <w:p>
+      <w:pPr>
+        <w:pStyle w:val="ListParagraph"/>
+        <w:numPr>
+          <w:ilvl w:val="0"/>
+          <w:numId w:val="1"/>
+        </w:numPr>
+      </w:pPr>
+    </w:p>
+    <w:p>
+      <w:pPr>
+        <w:pStyle w:val="Heading2"/>
+      </w:pPr>
+      <w:r>
+        <w:t xml:space="preserve">About </w:t>
+      </w:r>
+      <w:r>
+        <w:t>Page</w:t>
+      </w:r>
+    </w:p>
+    <w:p>
+      <w:pPr>
+        <w:pStyle w:val="ListParagraph"/>
+        <w:numPr>
+          <w:ilvl w:val="0"/>
+          <w:numId w:val="2"/>
+        </w:numPr>
+      </w:pPr>
+      <w:r>
+        <w:t>Added a hero section title</w:t>
+      </w:r>
+      <w:r>
+        <w:t>d “Our Mission” and underneath it is the mission of Pristine Renovations</w:t>
+      </w:r>
+    </w:p>
+    <w:p>
+      <w:pPr>
+        <w:pStyle w:val="ListParagraph"/>
+        <w:numPr>
+          <w:ilvl w:val="0"/>
+          <w:numId w:val="2"/>
+        </w:numPr>
+      </w:pPr>
+      <w:r>
+        <w:t xml:space="preserve">Style the “Our Story” Section and gave it a pretty </w:t>
+      </w:r>
+      <w:r>
+        <w:t xml:space="preserve">light maroon-crimson </w:t>
+      </w:r>
+      <w:r>
+        <w:t xml:space="preserve">colour. The text colour is white for the title and </w:t>
+      </w:r>
+      <w:r>
+        <w:t>light pink for the subtext.</w:t>
+      </w:r>
+    </w:p>
+    <w:p>
+      <w:pPr>
+        <w:pStyle w:val="ListParagraph"/>
+        <w:numPr>
+          <w:ilvl w:val="0"/>
+          <w:numId w:val="2"/>
+        </w:numPr>
+      </w:pPr>
+      <w:r>
+        <w:t>Added a fixed-attachment background for the “Expectations” section and used bullet points to list items.</w:t>
+      </w:r>
+    </w:p>
+    <w:p>
+      <w:pPr>
+        <w:pStyle w:val="ListParagraph"/>
+        <w:numPr>
+          <w:ilvl w:val="0"/>
+          <w:numId w:val="2"/>
+        </w:numPr>
+      </w:pPr>
+      <w:r>
+        <w:lastRenderedPageBreak/>
+        <w:t xml:space="preserve">Styled the testimonials by giving </w:t>
+      </w:r>
+      <w:r>
+        <w:t>them</w:t>
+      </w:r>
+      <w:r>
+        <w:t xml:space="preserve"> a nice thin maroon border, </w:t>
+      </w:r>
+      <w:r>
+        <w:t>smooth corners and also highlight the name of the person w</w:t>
+      </w:r>
+      <w:r>
+        <w:t xml:space="preserve">ith </w:t>
+      </w:r>
+      <w:r>
+        <w:t>whom the testimonial was from.</w:t>
+      </w:r>
+    </w:p>
+    <w:p>
+      <w:pPr>
+        <w:pStyle w:val="ListParagraph"/>
+        <w:numPr>
+          <w:ilvl w:val="0"/>
+          <w:numId w:val="2"/>
+        </w:numPr>
+      </w:pPr>
+      <w:r>
+        <w:t>A call-to-action section titled</w:t>
+      </w:r>
+      <w:r>
+        <w:t xml:space="preserve"> is added to the bottom of the page linking the user to the contact page.</w:t>
+      </w:r>
+    </w:p>
+    <w:p/>
+    <w:p>
+      <w:pPr>
+        <w:pStyle w:val="Heading2"/>
+      </w:pPr>
+      <w:r>
+        <w:t xml:space="preserve">Services </w:t>
+      </w:r>
+      <w:r>
+        <w:t>Page</w:t>
+      </w:r>
+    </w:p>
+    <w:p>
+      <w:pPr>
+        <w:pStyle w:val="ListParagraph"/>
+        <w:numPr>
+          <w:ilvl w:val="0"/>
+          <w:numId w:val="3"/>
+        </w:numPr>
+      </w:pPr>
+      <w:r>
+        <w:t xml:space="preserve">Used CSS grid to display the various services </w:t>
+      </w:r>
+      <w:r>
+        <w:t xml:space="preserve">offered by Pristine Renovations in a </w:t>
+      </w:r>
+      <w:r>
+        <w:t>3-column</w:t>
+      </w:r>
+      <w:r>
+        <w:t xml:space="preserve"> grid</w:t>
+      </w:r>
+    </w:p>
+    <w:p>
+      <w:pPr>
+        <w:pStyle w:val="ListParagraph"/>
+        <w:numPr>
+          <w:ilvl w:val="0"/>
+          <w:numId w:val="3"/>
+        </w:numPr>
+      </w:pPr>
+      <w:r>
+        <w:t xml:space="preserve">Each of the services are displayed a card within the grid and have a thin border on the outside, a maroon heading and </w:t>
+      </w:r>
+      <w:r>
+        <w:t>dark maroon coloured subtext</w:t>
+      </w:r>
+      <w:r>
+        <w:t>.</w:t>
+      </w:r>
+    </w:p>
+    <w:p>
+      <w:pPr>
+        <w:pStyle w:val="ListParagraph"/>
+        <w:numPr>
+          <w:ilvl w:val="0"/>
+          <w:numId w:val="3"/>
+        </w:numPr>
+      </w:pPr>
+      <w:r>
+        <w:t xml:space="preserve">When the cards are hovered over, they enlarge slightly to give a </w:t>
+      </w:r>
+      <w:r>
+        <w:t>livelier</w:t>
+      </w:r>
+      <w:r>
+        <w:t xml:space="preserve"> feel</w:t>
+      </w:r>
+      <w:r>
+        <w:t>.</w:t>
+      </w:r>
+    </w:p>
+    <w:p>
+      <w:pPr>
+        <w:pStyle w:val="ListParagraph"/>
+        <w:numPr>
+          <w:ilvl w:val="0"/>
+          <w:numId w:val="3"/>
+        </w:numPr>
+      </w:pPr>
+      <w:r>
+        <w:t xml:space="preserve">The section explaining our </w:t>
+      </w:r>
+      <w:r>
+        <w:t>pricing process has been</w:t>
+      </w:r>
+      <w:r>
+        <w:t xml:space="preserve"> placed in the middle and some colour changes to the heading and subtext to match the </w:t>
+      </w:r>
+      <w:r>
+        <w:t>overall colour them of the website</w:t>
+      </w:r>
+    </w:p>
+    <w:p>
+      <w:pPr>
+        <w:pStyle w:val="ListParagraph"/>
+        <w:numPr>
+          <w:ilvl w:val="0"/>
+          <w:numId w:val="3"/>
+        </w:numPr>
+      </w:pPr>
+      <w:r>
+        <w:t xml:space="preserve">A </w:t>
+      </w:r>
+      <w:r>
+        <w:t>call-to-action</w:t>
+      </w:r>
+      <w:r>
+        <w:t xml:space="preserve"> section was added to the bottom of the page which links directly to the Contact page</w:t>
+      </w:r>
+    </w:p>
+    <w:p/>
+    <w:p>
+      <w:pPr>
+        <w:pStyle w:val="Heading2"/>
+      </w:pPr>
+      <w:r>
+        <w:t>Gallery</w:t>
+      </w:r>
+      <w:r>
+        <w:t xml:space="preserve"> Page</w:t>
+      </w:r>
+    </w:p>
+    <w:p>
+      <w:pPr>
+        <w:pStyle w:val="ListParagraph"/>
+        <w:numPr>
+          <w:ilvl w:val="0"/>
+          <w:numId w:val="4"/>
+        </w:numPr>
+      </w:pPr>
+      <w:r>
+        <w:t>Used CSS</w:t>
+      </w:r>
+      <w:r>
+        <w:t xml:space="preserve"> grid to layout the various images and subtext</w:t>
+      </w:r>
+      <w:r>
+        <w:t xml:space="preserve">s </w:t>
+      </w:r>
+      <w:r>
+        <w:t>in</w:t>
+      </w:r>
+      <w:r>
+        <w:t xml:space="preserve"> a </w:t>
+      </w:r>
+      <w:r>
+        <w:t>two-column</w:t>
+      </w:r>
+      <w:r>
+        <w:t xml:space="preserve"> layout</w:t>
+      </w:r>
+    </w:p>
+    <w:p>
+      <w:pPr>
+        <w:pStyle w:val="ListParagraph"/>
+        <w:numPr>
+          <w:ilvl w:val="0"/>
+          <w:numId w:val="4"/>
+        </w:numPr>
+      </w:pPr>
+      <w:r>
+        <w:t xml:space="preserve">The images have a </w:t>
+      </w:r>
+      <w:r>
+        <w:t>round border</w:t>
+      </w:r>
+    </w:p>
+    <w:p>
+      <w:pPr>
+        <w:pStyle w:val="ListParagraph"/>
+        <w:numPr>
+          <w:ilvl w:val="0"/>
+          <w:numId w:val="4"/>
+        </w:numPr>
+      </w:pPr>
+      <w:r>
+        <w:t>The images have text underneath them now to give a brief description of the images.</w:t>
+      </w:r>
+    </w:p>
+    <w:p>
+      <w:pPr>
+        <w:pStyle w:val="ListParagraph"/>
+        <w:numPr>
+          <w:ilvl w:val="0"/>
+          <w:numId w:val="4"/>
+        </w:numPr>
+      </w:pPr>
+      <w:r>
+        <w:t xml:space="preserve">The currently hovered gallery element zooms in while the others shrink. If none of the gallery cards are hovered </w:t>
+      </w:r>
+      <w:r>
+        <w:t>over,</w:t>
+      </w:r>
+      <w:r>
+        <w:t xml:space="preserve"> they remain at their standard size.</w:t>
+      </w:r>
+    </w:p>
+    <w:p>
+      <w:r>
+        <w:t>q</w:t>
+      </w:r>
+    </w:p>
+    <w:p>
+      <w:pPr>
+        <w:pStyle w:val="Heading2"/>
+      </w:pPr>
+      <w:r>
+        <w:t xml:space="preserve">Contact </w:t>
+      </w:r>
+      <w:r>
+        <w:t>Page</w:t>
+      </w:r>
+    </w:p>
+    <w:p>
+      <w:pPr>
+        <w:pStyle w:val="ListParagraph"/>
+        <w:numPr>
+          <w:ilvl w:val="0"/>
+          <w:numId w:val="5"/>
+        </w:numPr>
+      </w:pPr>
+      <w:r>
+        <w:t>Added a hero-section background image with a fixed position</w:t>
+      </w:r>
+      <w:r>
+        <w:t xml:space="preserve"> (background-attachment: fixed)</w:t>
+      </w:r>
+    </w:p>
+    <w:p>
+      <w:pPr>
+        <w:pStyle w:val="ListParagraph"/>
+        <w:numPr>
+          <w:ilvl w:val="0"/>
+          <w:numId w:val="5"/>
+        </w:numPr>
+      </w:pPr>
+      <w:r>
+        <w:t>Styled the from to match the overall look of the website as closely as I could</w:t>
+      </w:r>
+    </w:p>
+    <w:p>
+      <w:pPr>
+        <w:pStyle w:val="ListParagraph"/>
+        <w:numPr>
+          <w:ilvl w:val="0"/>
+          <w:numId w:val="5"/>
+        </w:numPr>
+      </w:pPr>
+      <w:r>
+        <w:t xml:space="preserve">Added some minor colour to the Contact Details </w:t>
+      </w:r>
+      <w:r>
+        <w:t xml:space="preserve">section </w:t>
+      </w:r>
+    </w:p>
     <w:sectPr>
       <w:pgSz w:w="11906" w:h="16838"/>
       <w:pgMar w:top="1440" w:right="1440" w:bottom="1440" w:left="1440" w:header="708" w:footer="708" w:gutter="0"/>
@@ -11,6 +595,707 @@
     </w:sectPr>
   </w:body>
 </w:document>
+</file>
+
+<file path=word/numbering.xml><?xml version="1.0" encoding="utf-8"?>
+<w:numbering xmlns:wpc="http://schemas.microsoft.com/office/word/2010/wordprocessingCanvas" xmlns:cx="http://schemas.microsoft.com/office/drawing/2014/chartex" xmlns:cx1="http://schemas.microsoft.com/office/drawing/2015/9/8/chartex" xmlns:cx2="http://schemas.microsoft.com/office/drawing/2015/10/21/chartex" xmlns:cx3="http://schemas.microsoft.com/office/drawing/2016/5/9/chartex" xmlns:cx4="http://schemas.microsoft.com/office/drawing/2016/5/10/chartex" xmlns:cx5="http://schemas.microsoft.com/office/drawing/2016/5/11/chartex" xmlns:cx6="http://schemas.microsoft.com/office/drawing/2016/5/12/chartex" xmlns:cx7="http://schemas.microsoft.com/office/drawing/2016/5/13/chartex" xmlns:cx8="http://schemas.microsoft.com/office/drawing/2016/5/14/chartex" xmlns:mc="http://schemas.openxmlformats.org/markup-compatibility/2006" xmlns:aink="http://schemas.microsoft.com/office/drawing/2016/ink" xmlns:am3d="http://schemas.microsoft.com/office/drawing/2017/model3d" xmlns:o="urn:schemas-microsoft-com:office:office" xmlns:oel="http://schemas.microsoft.com/office/2019/extlst" xmlns:r="http://schemas.openxmlformats.org/officeDocument/2006/relationships" xmlns:m="http://schemas.openxmlformats.org/officeDocument/2006/math" xmlns:v="urn:schemas-microsoft-com:vml" xmlns:wp14="http://schemas.microsoft.com/office/word/2010/wordprocessingDrawing" xmlns:wp="http://schemas.openxmlformats.org/drawingml/2006/wordprocessingDrawing" xmlns:w10="urn:schemas-microsoft-com:office:word" xmlns:w="http://schemas.openxmlformats.org/wordprocessingml/2006/main" xmlns:w14="http://schemas.microsoft.com/office/word/2010/wordml" xmlns:w15="http://schemas.microsoft.com/office/word/2012/wordml" xmlns:w16cex="http://schemas.microsoft.com/office/word/2018/wordml/cex" xmlns:w16cid="http://schemas.microsoft.com/office/word/2016/wordml/cid" xmlns:w16="http://schemas.microsoft.com/office/word/2018/wordml" xmlns:w16du="http://schemas.microsoft.com/office/word/2023/wordml/word16du" xmlns:w16sdtdh="http://schemas.microsoft.com/office/word/2020/wordml/sdtdatahash" xmlns:w16sdtfl="http://schemas.microsoft.com/office/word/2024/wordml/sdtformatlock" xmlns:w16se="http://schemas.microsoft.com/office/word/2015/wordml/symex" xmlns:wpg="http://schemas.microsoft.com/office/word/2010/wordprocessingGroup" xmlns:wpi="http://schemas.microsoft.com/office/word/2010/wordprocessingInk" xmlns:wne="http://schemas.microsoft.com/office/word/2006/wordml" xmlns:wps="http://schemas.microsoft.com/office/word/2010/wordprocessingShape" mc:Ignorable="w14 w15 w16se w16cid w16 w16cex w16sdtdh w16sdtfl w16du wp14">
+  <w:abstractNum w:abstractNumId="0" w15:restartNumberingAfterBreak="0">
+    <w:nsid w:val="05C91FB6"/>
+    <w:multiLevelType w:val="hybridMultilevel"/>
+    <w:tmpl w:val="8AD0B9FC"/>
+    <w:lvl w:ilvl="0" w:tplc="04090001">
+      <w:start w:val="1"/>
+      <w:numFmt w:val="bullet"/>
+      <w:lvlText w:val=""/>
+      <w:lvlJc w:val="left"/>
+      <w:pPr>
+        <w:ind w:left="720" w:hanging="360"/>
+      </w:pPr>
+      <w:rPr>
+        <w:rFonts w:ascii="Symbol" w:hAnsi="Symbol" w:hint="default"/>
+      </w:rPr>
+    </w:lvl>
+    <w:lvl w:ilvl="1" w:tplc="04090003" w:tentative="1">
+      <w:start w:val="1"/>
+      <w:numFmt w:val="bullet"/>
+      <w:lvlText w:val="o"/>
+      <w:lvlJc w:val="left"/>
+      <w:pPr>
+        <w:ind w:left="1440" w:hanging="360"/>
+      </w:pPr>
+      <w:rPr>
+        <w:rFonts w:ascii="Courier New" w:hAnsi="Courier New" w:cs="Courier New" w:hint="default"/>
+      </w:rPr>
+    </w:lvl>
+    <w:lvl w:ilvl="2" w:tplc="04090005" w:tentative="1">
+      <w:start w:val="1"/>
+      <w:numFmt w:val="bullet"/>
+      <w:lvlText w:val=""/>
+      <w:lvlJc w:val="left"/>
+      <w:pPr>
+        <w:ind w:left="2160" w:hanging="360"/>
+      </w:pPr>
+      <w:rPr>
+        <w:rFonts w:ascii="Wingdings" w:hAnsi="Wingdings" w:hint="default"/>
+      </w:rPr>
+    </w:lvl>
+    <w:lvl w:ilvl="3" w:tplc="04090001" w:tentative="1">
+      <w:start w:val="1"/>
+      <w:numFmt w:val="bullet"/>
+      <w:lvlText w:val=""/>
+      <w:lvlJc w:val="left"/>
+      <w:pPr>
+        <w:ind w:left="2880" w:hanging="360"/>
+      </w:pPr>
+      <w:rPr>
+        <w:rFonts w:ascii="Symbol" w:hAnsi="Symbol" w:hint="default"/>
+      </w:rPr>
+    </w:lvl>
+    <w:lvl w:ilvl="4" w:tplc="04090003" w:tentative="1">
+      <w:start w:val="1"/>
+      <w:numFmt w:val="bullet"/>
+      <w:lvlText w:val="o"/>
+      <w:lvlJc w:val="left"/>
+      <w:pPr>
+        <w:ind w:left="3600" w:hanging="360"/>
+      </w:pPr>
+      <w:rPr>
+        <w:rFonts w:ascii="Courier New" w:hAnsi="Courier New" w:cs="Courier New" w:hint="default"/>
+      </w:rPr>
+    </w:lvl>
+    <w:lvl w:ilvl="5" w:tplc="04090005" w:tentative="1">
+      <w:start w:val="1"/>
+      <w:numFmt w:val="bullet"/>
+      <w:lvlText w:val=""/>
+      <w:lvlJc w:val="left"/>
+      <w:pPr>
+        <w:ind w:left="4320" w:hanging="360"/>
+      </w:pPr>
+      <w:rPr>
+        <w:rFonts w:ascii="Wingdings" w:hAnsi="Wingdings" w:hint="default"/>
+      </w:rPr>
+    </w:lvl>
+    <w:lvl w:ilvl="6" w:tplc="04090001" w:tentative="1">
+      <w:start w:val="1"/>
+      <w:numFmt w:val="bullet"/>
+      <w:lvlText w:val=""/>
+      <w:lvlJc w:val="left"/>
+      <w:pPr>
+        <w:ind w:left="5040" w:hanging="360"/>
+      </w:pPr>
+      <w:rPr>
+        <w:rFonts w:ascii="Symbol" w:hAnsi="Symbol" w:hint="default"/>
+      </w:rPr>
+    </w:lvl>
+    <w:lvl w:ilvl="7" w:tplc="04090003" w:tentative="1">
+      <w:start w:val="1"/>
+      <w:numFmt w:val="bullet"/>
+      <w:lvlText w:val="o"/>
+      <w:lvlJc w:val="left"/>
+      <w:pPr>
+        <w:ind w:left="5760" w:hanging="360"/>
+      </w:pPr>
+      <w:rPr>
+        <w:rFonts w:ascii="Courier New" w:hAnsi="Courier New" w:cs="Courier New" w:hint="default"/>
+      </w:rPr>
+    </w:lvl>
+    <w:lvl w:ilvl="8" w:tplc="04090005" w:tentative="1">
+      <w:start w:val="1"/>
+      <w:numFmt w:val="bullet"/>
+      <w:lvlText w:val=""/>
+      <w:lvlJc w:val="left"/>
+      <w:pPr>
+        <w:ind w:left="6480" w:hanging="360"/>
+      </w:pPr>
+      <w:rPr>
+        <w:rFonts w:ascii="Wingdings" w:hAnsi="Wingdings" w:hint="default"/>
+      </w:rPr>
+    </w:lvl>
+  </w:abstractNum>
+  <w:abstractNum w:abstractNumId="1" w15:restartNumberingAfterBreak="0">
+    <w:nsid w:val="0DA5229B"/>
+    <w:multiLevelType w:val="hybridMultilevel"/>
+    <w:tmpl w:val="94F02FE0"/>
+    <w:lvl w:ilvl="0" w:tplc="04090001">
+      <w:start w:val="1"/>
+      <w:numFmt w:val="bullet"/>
+      <w:lvlText w:val=""/>
+      <w:lvlJc w:val="left"/>
+      <w:pPr>
+        <w:ind w:left="720" w:hanging="360"/>
+      </w:pPr>
+      <w:rPr>
+        <w:rFonts w:ascii="Symbol" w:hAnsi="Symbol" w:hint="default"/>
+      </w:rPr>
+    </w:lvl>
+    <w:lvl w:ilvl="1" w:tplc="04090003" w:tentative="1">
+      <w:start w:val="1"/>
+      <w:numFmt w:val="bullet"/>
+      <w:lvlText w:val="o"/>
+      <w:lvlJc w:val="left"/>
+      <w:pPr>
+        <w:ind w:left="1440" w:hanging="360"/>
+      </w:pPr>
+      <w:rPr>
+        <w:rFonts w:ascii="Courier New" w:hAnsi="Courier New" w:cs="Courier New" w:hint="default"/>
+      </w:rPr>
+    </w:lvl>
+    <w:lvl w:ilvl="2" w:tplc="04090005" w:tentative="1">
+      <w:start w:val="1"/>
+      <w:numFmt w:val="bullet"/>
+      <w:lvlText w:val=""/>
+      <w:lvlJc w:val="left"/>
+      <w:pPr>
+        <w:ind w:left="2160" w:hanging="360"/>
+      </w:pPr>
+      <w:rPr>
+        <w:rFonts w:ascii="Wingdings" w:hAnsi="Wingdings" w:hint="default"/>
+      </w:rPr>
+    </w:lvl>
+    <w:lvl w:ilvl="3" w:tplc="04090001" w:tentative="1">
+      <w:start w:val="1"/>
+      <w:numFmt w:val="bullet"/>
+      <w:lvlText w:val=""/>
+      <w:lvlJc w:val="left"/>
+      <w:pPr>
+        <w:ind w:left="2880" w:hanging="360"/>
+      </w:pPr>
+      <w:rPr>
+        <w:rFonts w:ascii="Symbol" w:hAnsi="Symbol" w:hint="default"/>
+      </w:rPr>
+    </w:lvl>
+    <w:lvl w:ilvl="4" w:tplc="04090003" w:tentative="1">
+      <w:start w:val="1"/>
+      <w:numFmt w:val="bullet"/>
+      <w:lvlText w:val="o"/>
+      <w:lvlJc w:val="left"/>
+      <w:pPr>
+        <w:ind w:left="3600" w:hanging="360"/>
+      </w:pPr>
+      <w:rPr>
+        <w:rFonts w:ascii="Courier New" w:hAnsi="Courier New" w:cs="Courier New" w:hint="default"/>
+      </w:rPr>
+    </w:lvl>
+    <w:lvl w:ilvl="5" w:tplc="04090005" w:tentative="1">
+      <w:start w:val="1"/>
+      <w:numFmt w:val="bullet"/>
+      <w:lvlText w:val=""/>
+      <w:lvlJc w:val="left"/>
+      <w:pPr>
+        <w:ind w:left="4320" w:hanging="360"/>
+      </w:pPr>
+      <w:rPr>
+        <w:rFonts w:ascii="Wingdings" w:hAnsi="Wingdings" w:hint="default"/>
+      </w:rPr>
+    </w:lvl>
+    <w:lvl w:ilvl="6" w:tplc="04090001" w:tentative="1">
+      <w:start w:val="1"/>
+      <w:numFmt w:val="bullet"/>
+      <w:lvlText w:val=""/>
+      <w:lvlJc w:val="left"/>
+      <w:pPr>
+        <w:ind w:left="5040" w:hanging="360"/>
+      </w:pPr>
+      <w:rPr>
+        <w:rFonts w:ascii="Symbol" w:hAnsi="Symbol" w:hint="default"/>
+      </w:rPr>
+    </w:lvl>
+    <w:lvl w:ilvl="7" w:tplc="04090003" w:tentative="1">
+      <w:start w:val="1"/>
+      <w:numFmt w:val="bullet"/>
+      <w:lvlText w:val="o"/>
+      <w:lvlJc w:val="left"/>
+      <w:pPr>
+        <w:ind w:left="5760" w:hanging="360"/>
+      </w:pPr>
+      <w:rPr>
+        <w:rFonts w:ascii="Courier New" w:hAnsi="Courier New" w:cs="Courier New" w:hint="default"/>
+      </w:rPr>
+    </w:lvl>
+    <w:lvl w:ilvl="8" w:tplc="04090005" w:tentative="1">
+      <w:start w:val="1"/>
+      <w:numFmt w:val="bullet"/>
+      <w:lvlText w:val=""/>
+      <w:lvlJc w:val="left"/>
+      <w:pPr>
+        <w:ind w:left="6480" w:hanging="360"/>
+      </w:pPr>
+      <w:rPr>
+        <w:rFonts w:ascii="Wingdings" w:hAnsi="Wingdings" w:hint="default"/>
+      </w:rPr>
+    </w:lvl>
+  </w:abstractNum>
+  <w:abstractNum w:abstractNumId="2" w15:restartNumberingAfterBreak="0">
+    <w:nsid w:val="1F860764"/>
+    <w:multiLevelType w:val="hybridMultilevel"/>
+    <w:tmpl w:val="7178A3C8"/>
+    <w:lvl w:ilvl="0" w:tplc="04090001">
+      <w:start w:val="1"/>
+      <w:numFmt w:val="bullet"/>
+      <w:lvlText w:val=""/>
+      <w:lvlJc w:val="left"/>
+      <w:pPr>
+        <w:ind w:left="720" w:hanging="360"/>
+      </w:pPr>
+      <w:rPr>
+        <w:rFonts w:ascii="Symbol" w:hAnsi="Symbol" w:hint="default"/>
+      </w:rPr>
+    </w:lvl>
+    <w:lvl w:ilvl="1" w:tplc="04090003" w:tentative="1">
+      <w:start w:val="1"/>
+      <w:numFmt w:val="bullet"/>
+      <w:lvlText w:val="o"/>
+      <w:lvlJc w:val="left"/>
+      <w:pPr>
+        <w:ind w:left="1440" w:hanging="360"/>
+      </w:pPr>
+      <w:rPr>
+        <w:rFonts w:ascii="Courier New" w:hAnsi="Courier New" w:cs="Courier New" w:hint="default"/>
+      </w:rPr>
+    </w:lvl>
+    <w:lvl w:ilvl="2" w:tplc="04090005" w:tentative="1">
+      <w:start w:val="1"/>
+      <w:numFmt w:val="bullet"/>
+      <w:lvlText w:val=""/>
+      <w:lvlJc w:val="left"/>
+      <w:pPr>
+        <w:ind w:left="2160" w:hanging="360"/>
+      </w:pPr>
+      <w:rPr>
+        <w:rFonts w:ascii="Wingdings" w:hAnsi="Wingdings" w:hint="default"/>
+      </w:rPr>
+    </w:lvl>
+    <w:lvl w:ilvl="3" w:tplc="04090001" w:tentative="1">
+      <w:start w:val="1"/>
+      <w:numFmt w:val="bullet"/>
+      <w:lvlText w:val=""/>
+      <w:lvlJc w:val="left"/>
+      <w:pPr>
+        <w:ind w:left="2880" w:hanging="360"/>
+      </w:pPr>
+      <w:rPr>
+        <w:rFonts w:ascii="Symbol" w:hAnsi="Symbol" w:hint="default"/>
+      </w:rPr>
+    </w:lvl>
+    <w:lvl w:ilvl="4" w:tplc="04090003" w:tentative="1">
+      <w:start w:val="1"/>
+      <w:numFmt w:val="bullet"/>
+      <w:lvlText w:val="o"/>
+      <w:lvlJc w:val="left"/>
+      <w:pPr>
+        <w:ind w:left="3600" w:hanging="360"/>
+      </w:pPr>
+      <w:rPr>
+        <w:rFonts w:ascii="Courier New" w:hAnsi="Courier New" w:cs="Courier New" w:hint="default"/>
+      </w:rPr>
+    </w:lvl>
+    <w:lvl w:ilvl="5" w:tplc="04090005" w:tentative="1">
+      <w:start w:val="1"/>
+      <w:numFmt w:val="bullet"/>
+      <w:lvlText w:val=""/>
+      <w:lvlJc w:val="left"/>
+      <w:pPr>
+        <w:ind w:left="4320" w:hanging="360"/>
+      </w:pPr>
+      <w:rPr>
+        <w:rFonts w:ascii="Wingdings" w:hAnsi="Wingdings" w:hint="default"/>
+      </w:rPr>
+    </w:lvl>
+    <w:lvl w:ilvl="6" w:tplc="04090001" w:tentative="1">
+      <w:start w:val="1"/>
+      <w:numFmt w:val="bullet"/>
+      <w:lvlText w:val=""/>
+      <w:lvlJc w:val="left"/>
+      <w:pPr>
+        <w:ind w:left="5040" w:hanging="360"/>
+      </w:pPr>
+      <w:rPr>
+        <w:rFonts w:ascii="Symbol" w:hAnsi="Symbol" w:hint="default"/>
+      </w:rPr>
+    </w:lvl>
+    <w:lvl w:ilvl="7" w:tplc="04090003" w:tentative="1">
+      <w:start w:val="1"/>
+      <w:numFmt w:val="bullet"/>
+      <w:lvlText w:val="o"/>
+      <w:lvlJc w:val="left"/>
+      <w:pPr>
+        <w:ind w:left="5760" w:hanging="360"/>
+      </w:pPr>
+      <w:rPr>
+        <w:rFonts w:ascii="Courier New" w:hAnsi="Courier New" w:cs="Courier New" w:hint="default"/>
+      </w:rPr>
+    </w:lvl>
+    <w:lvl w:ilvl="8" w:tplc="04090005" w:tentative="1">
+      <w:start w:val="1"/>
+      <w:numFmt w:val="bullet"/>
+      <w:lvlText w:val=""/>
+      <w:lvlJc w:val="left"/>
+      <w:pPr>
+        <w:ind w:left="6480" w:hanging="360"/>
+      </w:pPr>
+      <w:rPr>
+        <w:rFonts w:ascii="Wingdings" w:hAnsi="Wingdings" w:hint="default"/>
+      </w:rPr>
+    </w:lvl>
+  </w:abstractNum>
+  <w:abstractNum w:abstractNumId="3" w15:restartNumberingAfterBreak="0">
+    <w:nsid w:val="2FCA0D8B"/>
+    <w:multiLevelType w:val="hybridMultilevel"/>
+    <w:tmpl w:val="84226BA6"/>
+    <w:lvl w:ilvl="0" w:tplc="04090001">
+      <w:start w:val="1"/>
+      <w:numFmt w:val="bullet"/>
+      <w:lvlText w:val=""/>
+      <w:lvlJc w:val="left"/>
+      <w:pPr>
+        <w:ind w:left="720" w:hanging="360"/>
+      </w:pPr>
+      <w:rPr>
+        <w:rFonts w:ascii="Symbol" w:hAnsi="Symbol" w:hint="default"/>
+      </w:rPr>
+    </w:lvl>
+    <w:lvl w:ilvl="1" w:tplc="04090003" w:tentative="1">
+      <w:start w:val="1"/>
+      <w:numFmt w:val="bullet"/>
+      <w:lvlText w:val="o"/>
+      <w:lvlJc w:val="left"/>
+      <w:pPr>
+        <w:ind w:left="1440" w:hanging="360"/>
+      </w:pPr>
+      <w:rPr>
+        <w:rFonts w:ascii="Courier New" w:hAnsi="Courier New" w:cs="Courier New" w:hint="default"/>
+      </w:rPr>
+    </w:lvl>
+    <w:lvl w:ilvl="2" w:tplc="04090005" w:tentative="1">
+      <w:start w:val="1"/>
+      <w:numFmt w:val="bullet"/>
+      <w:lvlText w:val=""/>
+      <w:lvlJc w:val="left"/>
+      <w:pPr>
+        <w:ind w:left="2160" w:hanging="360"/>
+      </w:pPr>
+      <w:rPr>
+        <w:rFonts w:ascii="Wingdings" w:hAnsi="Wingdings" w:hint="default"/>
+      </w:rPr>
+    </w:lvl>
+    <w:lvl w:ilvl="3" w:tplc="04090001" w:tentative="1">
+      <w:start w:val="1"/>
+      <w:numFmt w:val="bullet"/>
+      <w:lvlText w:val=""/>
+      <w:lvlJc w:val="left"/>
+      <w:pPr>
+        <w:ind w:left="2880" w:hanging="360"/>
+      </w:pPr>
+      <w:rPr>
+        <w:rFonts w:ascii="Symbol" w:hAnsi="Symbol" w:hint="default"/>
+      </w:rPr>
+    </w:lvl>
+    <w:lvl w:ilvl="4" w:tplc="04090003" w:tentative="1">
+      <w:start w:val="1"/>
+      <w:numFmt w:val="bullet"/>
+      <w:lvlText w:val="o"/>
+      <w:lvlJc w:val="left"/>
+      <w:pPr>
+        <w:ind w:left="3600" w:hanging="360"/>
+      </w:pPr>
+      <w:rPr>
+        <w:rFonts w:ascii="Courier New" w:hAnsi="Courier New" w:cs="Courier New" w:hint="default"/>
+      </w:rPr>
+    </w:lvl>
+    <w:lvl w:ilvl="5" w:tplc="04090005" w:tentative="1">
+      <w:start w:val="1"/>
+      <w:numFmt w:val="bullet"/>
+      <w:lvlText w:val=""/>
+      <w:lvlJc w:val="left"/>
+      <w:pPr>
+        <w:ind w:left="4320" w:hanging="360"/>
+      </w:pPr>
+      <w:rPr>
+        <w:rFonts w:ascii="Wingdings" w:hAnsi="Wingdings" w:hint="default"/>
+      </w:rPr>
+    </w:lvl>
+    <w:lvl w:ilvl="6" w:tplc="04090001" w:tentative="1">
+      <w:start w:val="1"/>
+      <w:numFmt w:val="bullet"/>
+      <w:lvlText w:val=""/>
+      <w:lvlJc w:val="left"/>
+      <w:pPr>
+        <w:ind w:left="5040" w:hanging="360"/>
+      </w:pPr>
+      <w:rPr>
+        <w:rFonts w:ascii="Symbol" w:hAnsi="Symbol" w:hint="default"/>
+      </w:rPr>
+    </w:lvl>
+    <w:lvl w:ilvl="7" w:tplc="04090003" w:tentative="1">
+      <w:start w:val="1"/>
+      <w:numFmt w:val="bullet"/>
+      <w:lvlText w:val="o"/>
+      <w:lvlJc w:val="left"/>
+      <w:pPr>
+        <w:ind w:left="5760" w:hanging="360"/>
+      </w:pPr>
+      <w:rPr>
+        <w:rFonts w:ascii="Courier New" w:hAnsi="Courier New" w:cs="Courier New" w:hint="default"/>
+      </w:rPr>
+    </w:lvl>
+    <w:lvl w:ilvl="8" w:tplc="04090005" w:tentative="1">
+      <w:start w:val="1"/>
+      <w:numFmt w:val="bullet"/>
+      <w:lvlText w:val=""/>
+      <w:lvlJc w:val="left"/>
+      <w:pPr>
+        <w:ind w:left="6480" w:hanging="360"/>
+      </w:pPr>
+      <w:rPr>
+        <w:rFonts w:ascii="Wingdings" w:hAnsi="Wingdings" w:hint="default"/>
+      </w:rPr>
+    </w:lvl>
+  </w:abstractNum>
+  <w:abstractNum w:abstractNumId="4" w15:restartNumberingAfterBreak="0">
+    <w:nsid w:val="47B83253"/>
+    <w:multiLevelType w:val="hybridMultilevel"/>
+    <w:tmpl w:val="97AE71E2"/>
+    <w:lvl w:ilvl="0" w:tplc="04090001">
+      <w:start w:val="1"/>
+      <w:numFmt w:val="bullet"/>
+      <w:lvlText w:val=""/>
+      <w:lvlJc w:val="left"/>
+      <w:pPr>
+        <w:ind w:left="720" w:hanging="360"/>
+      </w:pPr>
+      <w:rPr>
+        <w:rFonts w:ascii="Symbol" w:hAnsi="Symbol" w:hint="default"/>
+      </w:rPr>
+    </w:lvl>
+    <w:lvl w:ilvl="1" w:tplc="04090003" w:tentative="1">
+      <w:start w:val="1"/>
+      <w:numFmt w:val="bullet"/>
+      <w:lvlText w:val="o"/>
+      <w:lvlJc w:val="left"/>
+      <w:pPr>
+        <w:ind w:left="1440" w:hanging="360"/>
+      </w:pPr>
+      <w:rPr>
+        <w:rFonts w:ascii="Courier New" w:hAnsi="Courier New" w:cs="Courier New" w:hint="default"/>
+      </w:rPr>
+    </w:lvl>
+    <w:lvl w:ilvl="2" w:tplc="04090005" w:tentative="1">
+      <w:start w:val="1"/>
+      <w:numFmt w:val="bullet"/>
+      <w:lvlText w:val=""/>
+      <w:lvlJc w:val="left"/>
+      <w:pPr>
+        <w:ind w:left="2160" w:hanging="360"/>
+      </w:pPr>
+      <w:rPr>
+        <w:rFonts w:ascii="Wingdings" w:hAnsi="Wingdings" w:hint="default"/>
+      </w:rPr>
+    </w:lvl>
+    <w:lvl w:ilvl="3" w:tplc="04090001" w:tentative="1">
+      <w:start w:val="1"/>
+      <w:numFmt w:val="bullet"/>
+      <w:lvlText w:val=""/>
+      <w:lvlJc w:val="left"/>
+      <w:pPr>
+        <w:ind w:left="2880" w:hanging="360"/>
+      </w:pPr>
+      <w:rPr>
+        <w:rFonts w:ascii="Symbol" w:hAnsi="Symbol" w:hint="default"/>
+      </w:rPr>
+    </w:lvl>
+    <w:lvl w:ilvl="4" w:tplc="04090003" w:tentative="1">
+      <w:start w:val="1"/>
+      <w:numFmt w:val="bullet"/>
+      <w:lvlText w:val="o"/>
+      <w:lvlJc w:val="left"/>
+      <w:pPr>
+        <w:ind w:left="3600" w:hanging="360"/>
+      </w:pPr>
+      <w:rPr>
+        <w:rFonts w:ascii="Courier New" w:hAnsi="Courier New" w:cs="Courier New" w:hint="default"/>
+      </w:rPr>
+    </w:lvl>
+    <w:lvl w:ilvl="5" w:tplc="04090005" w:tentative="1">
+      <w:start w:val="1"/>
+      <w:numFmt w:val="bullet"/>
+      <w:lvlText w:val=""/>
+      <w:lvlJc w:val="left"/>
+      <w:pPr>
+        <w:ind w:left="4320" w:hanging="360"/>
+      </w:pPr>
+      <w:rPr>
+        <w:rFonts w:ascii="Wingdings" w:hAnsi="Wingdings" w:hint="default"/>
+      </w:rPr>
+    </w:lvl>
+    <w:lvl w:ilvl="6" w:tplc="04090001" w:tentative="1">
+      <w:start w:val="1"/>
+      <w:numFmt w:val="bullet"/>
+      <w:lvlText w:val=""/>
+      <w:lvlJc w:val="left"/>
+      <w:pPr>
+        <w:ind w:left="5040" w:hanging="360"/>
+      </w:pPr>
+      <w:rPr>
+        <w:rFonts w:ascii="Symbol" w:hAnsi="Symbol" w:hint="default"/>
+      </w:rPr>
+    </w:lvl>
+    <w:lvl w:ilvl="7" w:tplc="04090003" w:tentative="1">
+      <w:start w:val="1"/>
+      <w:numFmt w:val="bullet"/>
+      <w:lvlText w:val="o"/>
+      <w:lvlJc w:val="left"/>
+      <w:pPr>
+        <w:ind w:left="5760" w:hanging="360"/>
+      </w:pPr>
+      <w:rPr>
+        <w:rFonts w:ascii="Courier New" w:hAnsi="Courier New" w:cs="Courier New" w:hint="default"/>
+      </w:rPr>
+    </w:lvl>
+    <w:lvl w:ilvl="8" w:tplc="04090005" w:tentative="1">
+      <w:start w:val="1"/>
+      <w:numFmt w:val="bullet"/>
+      <w:lvlText w:val=""/>
+      <w:lvlJc w:val="left"/>
+      <w:pPr>
+        <w:ind w:left="6480" w:hanging="360"/>
+      </w:pPr>
+      <w:rPr>
+        <w:rFonts w:ascii="Wingdings" w:hAnsi="Wingdings" w:hint="default"/>
+      </w:rPr>
+    </w:lvl>
+  </w:abstractNum>
+  <w:abstractNum w:abstractNumId="5" w15:restartNumberingAfterBreak="0">
+    <w:nsid w:val="78FA62F8"/>
+    <w:multiLevelType w:val="hybridMultilevel"/>
+    <w:tmpl w:val="29588AD8"/>
+    <w:lvl w:ilvl="0" w:tplc="04090001">
+      <w:start w:val="1"/>
+      <w:numFmt w:val="bullet"/>
+      <w:lvlText w:val=""/>
+      <w:lvlJc w:val="left"/>
+      <w:pPr>
+        <w:ind w:left="720" w:hanging="360"/>
+      </w:pPr>
+      <w:rPr>
+        <w:rFonts w:ascii="Symbol" w:hAnsi="Symbol" w:hint="default"/>
+      </w:rPr>
+    </w:lvl>
+    <w:lvl w:ilvl="1" w:tplc="04090003" w:tentative="1">
+      <w:start w:val="1"/>
+      <w:numFmt w:val="bullet"/>
+      <w:lvlText w:val="o"/>
+      <w:lvlJc w:val="left"/>
+      <w:pPr>
+        <w:ind w:left="1440" w:hanging="360"/>
+      </w:pPr>
+      <w:rPr>
+        <w:rFonts w:ascii="Courier New" w:hAnsi="Courier New" w:cs="Courier New" w:hint="default"/>
+      </w:rPr>
+    </w:lvl>
+    <w:lvl w:ilvl="2" w:tplc="04090005" w:tentative="1">
+      <w:start w:val="1"/>
+      <w:numFmt w:val="bullet"/>
+      <w:lvlText w:val=""/>
+      <w:lvlJc w:val="left"/>
+      <w:pPr>
+        <w:ind w:left="2160" w:hanging="360"/>
+      </w:pPr>
+      <w:rPr>
+        <w:rFonts w:ascii="Wingdings" w:hAnsi="Wingdings" w:hint="default"/>
+      </w:rPr>
+    </w:lvl>
+    <w:lvl w:ilvl="3" w:tplc="04090001" w:tentative="1">
+      <w:start w:val="1"/>
+      <w:numFmt w:val="bullet"/>
+      <w:lvlText w:val=""/>
+      <w:lvlJc w:val="left"/>
+      <w:pPr>
+        <w:ind w:left="2880" w:hanging="360"/>
+      </w:pPr>
+      <w:rPr>
+        <w:rFonts w:ascii="Symbol" w:hAnsi="Symbol" w:hint="default"/>
+      </w:rPr>
+    </w:lvl>
+    <w:lvl w:ilvl="4" w:tplc="04090003" w:tentative="1">
+      <w:start w:val="1"/>
+      <w:numFmt w:val="bullet"/>
+      <w:lvlText w:val="o"/>
+      <w:lvlJc w:val="left"/>
+      <w:pPr>
+        <w:ind w:left="3600" w:hanging="360"/>
+      </w:pPr>
+      <w:rPr>
+        <w:rFonts w:ascii="Courier New" w:hAnsi="Courier New" w:cs="Courier New" w:hint="default"/>
+      </w:rPr>
+    </w:lvl>
+    <w:lvl w:ilvl="5" w:tplc="04090005" w:tentative="1">
+      <w:start w:val="1"/>
+      <w:numFmt w:val="bullet"/>
+      <w:lvlText w:val=""/>
+      <w:lvlJc w:val="left"/>
+      <w:pPr>
+        <w:ind w:left="4320" w:hanging="360"/>
+      </w:pPr>
+      <w:rPr>
+        <w:rFonts w:ascii="Wingdings" w:hAnsi="Wingdings" w:hint="default"/>
+      </w:rPr>
+    </w:lvl>
+    <w:lvl w:ilvl="6" w:tplc="04090001" w:tentative="1">
+      <w:start w:val="1"/>
+      <w:numFmt w:val="bullet"/>
+      <w:lvlText w:val=""/>
+      <w:lvlJc w:val="left"/>
+      <w:pPr>
+        <w:ind w:left="5040" w:hanging="360"/>
+      </w:pPr>
+      <w:rPr>
+        <w:rFonts w:ascii="Symbol" w:hAnsi="Symbol" w:hint="default"/>
+      </w:rPr>
+    </w:lvl>
+    <w:lvl w:ilvl="7" w:tplc="04090003" w:tentative="1">
+      <w:start w:val="1"/>
+      <w:numFmt w:val="bullet"/>
+      <w:lvlText w:val="o"/>
+      <w:lvlJc w:val="left"/>
+      <w:pPr>
+        <w:ind w:left="5760" w:hanging="360"/>
+      </w:pPr>
+      <w:rPr>
+        <w:rFonts w:ascii="Courier New" w:hAnsi="Courier New" w:cs="Courier New" w:hint="default"/>
+      </w:rPr>
+    </w:lvl>
+    <w:lvl w:ilvl="8" w:tplc="04090005" w:tentative="1">
+      <w:start w:val="1"/>
+      <w:numFmt w:val="bullet"/>
+      <w:lvlText w:val=""/>
+      <w:lvlJc w:val="left"/>
+      <w:pPr>
+        <w:ind w:left="6480" w:hanging="360"/>
+      </w:pPr>
+      <w:rPr>
+        <w:rFonts w:ascii="Wingdings" w:hAnsi="Wingdings" w:hint="default"/>
+      </w:rPr>
+    </w:lvl>
+  </w:abstractNum>
+  <w:num w:numId="1" w16cid:durableId="909848503">
+    <w:abstractNumId w:val="4"/>
+  </w:num>
+  <w:num w:numId="2" w16cid:durableId="1289165322">
+    <w:abstractNumId w:val="2"/>
+  </w:num>
+  <w:num w:numId="3" w16cid:durableId="1009019177">
+    <w:abstractNumId w:val="0"/>
+  </w:num>
+  <w:num w:numId="4" w16cid:durableId="1248348424">
+    <w:abstractNumId w:val="1"/>
+  </w:num>
+  <w:num w:numId="5" w16cid:durableId="221604727">
+    <w:abstractNumId w:val="5"/>
+  </w:num>
+  <w:num w:numId="6" w16cid:durableId="1289311802">
+    <w:abstractNumId w:val="3"/>
+  </w:num>
+</w:numbering>
 </file>
 
 <file path=word/styles.xml><?xml version="1.0" encoding="utf-8"?>
@@ -441,7 +1726,6 @@
     <w:next w:val="Normal"/>
     <w:link w:val="Heading2Char"/>
     <w:uiPriority w:val="9"/>
-    <w:semiHidden/>
     <w:unhideWhenUsed/>
     <w:qFormat/>
     <w:rsid w:val="00CE3122"/>
@@ -658,7 +1942,6 @@
     <w:basedOn w:val="DefaultParagraphFont"/>
     <w:link w:val="Heading2"/>
     <w:uiPriority w:val="9"/>
-    <w:semiHidden/>
     <w:rsid w:val="00CE3122"/>
     <w:rPr>
       <w:rFonts w:asciiTheme="majorHAnsi" w:eastAsiaTheme="majorEastAsia" w:hAnsiTheme="majorHAnsi" w:cstheme="majorBidi"/>
@@ -1246,4 +2529,22 @@
     </a:ext>
   </a:extLst>
 </a:theme>
+</file>
+
+<file path=customXml/item1.xml><?xml version="1.0" encoding="utf-8"?>
+<b:Sources xmlns:b="http://schemas.openxmlformats.org/officeDocument/2006/bibliography" xmlns="http://schemas.openxmlformats.org/officeDocument/2006/bibliography" SelectedStyle="\HarvardAnglia2008OfficeOnline.xsl" StyleName="Harvard - Anglia" Version="2008"/>
+</file>
+
+<file path=customXml/itemProps1.xml><?xml version="1.0" encoding="utf-8"?>
+<ds:datastoreItem xmlns:ds="http://schemas.openxmlformats.org/officeDocument/2006/customXml" ds:itemID="{85F3D3E0-336D-4097-9EA1-C7DFFC0C6993}">
+  <ds:schemaRefs>
+    <ds:schemaRef ds:uri="http://schemas.openxmlformats.org/officeDocument/2006/bibliography"/>
+  </ds:schemaRefs>
+</ds:datastoreItem>
+</file>
+
+<file path=docMetadata/LabelInfo.xml><?xml version="1.0" encoding="utf-8"?>
+<clbl:labelList xmlns:clbl="http://schemas.microsoft.com/office/2020/mipLabelMetadata">
+  <clbl:label id="{e10c8f44-f469-448f-bc0d-d781288ff01b}" enabled="0" method="" siteId="{e10c8f44-f469-448f-bc0d-d781288ff01b}" removed="1"/>
+</clbl:labelList>
 </file>
</xml_diff>